<commit_message>
PHAN_CONG_SUA: cập nhật 16/10 – trạng thái từng việc, H3, lịch còn lại, chia phần slide; dựng lại bản Word
- Bảng phân công thêm cột trạng thái 16/10 và bảng hạn (18/10 → 28/10).
- H3: hai chỗ cần sửa trong PR #6 (dòng tổng 04_csdl 1.873, thứ tự TC37/TC38)
  và chạy TC37/TC38 trên SQL Server trước khi gộp.
- Luận: câu "Cả 38 ca" đã được PR #6 viết lại, không sửa riêng.
- Q4: mục 3.3 không cần sửa (PR #6 đã viết lại).
- Mục 7 mới: đề xuất chia 16 slide cho 6 người.
- Báo cáo tiến độ sửa cho khớp (bỏ việc "38 ca" của Luận, thêm hạn slide).

Co-Authored-By: Claude Opus 5.5 <noreply@anthropic.com>
Claude-Session: https://claude.ai/code/session_01GKrJgGNg38NpTbEnAS31pf
</commit_message>
<xml_diff>
--- a/bao_cao/Tien_do_Nhom_10_16-10-2026.docx
+++ b/bao_cao/Tien_do_Nhom_10_16-10-2026.docx
@@ -4733,64 +4733,8 @@
                 <w:sz w:val="22"/>
                 <w:szCs w:val="22"/>
               </w:rPr>
-              <w:t xml:space="preserve">Việc nhỏ thêm</w:t>
-            </w:r>
-          </w:p>
-        </w:tc>
-        <w:tc>
-          <w:tcPr>
-            <w:tcW w:type="dxa" w:w="1400"/>
-            <w:tcBorders>
-              <w:top w:val="single" w:color="BFBFBF" w:sz="4"/>
-              <w:left w:val="single" w:color="BFBFBF" w:sz="4"/>
-              <w:bottom w:val="single" w:color="BFBFBF" w:sz="4"/>
-              <w:right w:val="single" w:color="BFBFBF" w:sz="4"/>
-            </w:tcBorders>
-            <w:tcMar>
-              <w:top w:type="dxa" w:w="60"/>
-              <w:left w:type="dxa" w:w="100"/>
-              <w:bottom w:type="dxa" w:w="60"/>
-              <w:right w:type="dxa" w:w="100"/>
-            </w:tcMar>
-          </w:tcPr>
-          <w:p>
-            <w:pPr>
-              <w:spacing w:after="40" w:line="252"/>
-              <w:jc w:val="left"/>
-            </w:pPr>
-            <w:r>
-              <w:rPr>
-                <w:rFonts w:ascii="Times New Roman" w:cs="Times New Roman" w:eastAsia="Times New Roman" w:hAnsi="Times New Roman"/>
-                <w:b w:val="false"/>
-                <w:bCs w:val="false"/>
-                <w:sz w:val="22"/>
-                <w:szCs w:val="22"/>
-              </w:rPr>
-              <w:t xml:space="preserve">Mới</w:t>
-            </w:r>
-          </w:p>
-        </w:tc>
-        <w:tc>
-          <w:tcPr>
-            <w:tcW w:type="dxa" w:w="4938"/>
-            <w:tcBorders>
-              <w:top w:val="single" w:color="BFBFBF" w:sz="4"/>
-              <w:left w:val="single" w:color="BFBFBF" w:sz="4"/>
-              <w:bottom w:val="single" w:color="BFBFBF" w:sz="4"/>
-              <w:right w:val="single" w:color="BFBFBF" w:sz="4"/>
-            </w:tcBorders>
-            <w:tcMar>
-              <w:top w:type="dxa" w:w="60"/>
-              <w:left w:type="dxa" w:w="100"/>
-              <w:bottom w:type="dxa" w:w="60"/>
-              <w:right w:type="dxa" w:w="100"/>
-            </w:tcMar>
-          </w:tcPr>
-          <w:p>
-            <w:pPr>
-              <w:spacing w:after="40" w:line="252"/>
-              <w:jc w:val="left"/>
-            </w:pPr>
+              <w:t xml:space="preserve">Câu "Cả 38 ca" ở </w:t>
+            </w:r>
             <w:r>
               <w:rPr>
                 <w:rFonts w:ascii="Consolas" w:cs="Consolas" w:eastAsia="Consolas" w:hAnsi="Consolas"/>
@@ -4807,7 +4751,91 @@
                 <w:sz w:val="22"/>
                 <w:szCs w:val="22"/>
               </w:rPr>
-              <w:t xml:space="preserve"> mục 4.2 vẫn ghi "Cả 38 ca" trong khi bảng đã có 40 ca (thêm TC39, TC40): sửa câu này</w:t>
+              <w:t xml:space="preserve"> mục 4.2</w:t>
+            </w:r>
+          </w:p>
+        </w:tc>
+        <w:tc>
+          <w:tcPr>
+            <w:tcW w:type="dxa" w:w="1400"/>
+            <w:tcBorders>
+              <w:top w:val="single" w:color="BFBFBF" w:sz="4"/>
+              <w:left w:val="single" w:color="BFBFBF" w:sz="4"/>
+              <w:bottom w:val="single" w:color="BFBFBF" w:sz="4"/>
+              <w:right w:val="single" w:color="BFBFBF" w:sz="4"/>
+            </w:tcBorders>
+            <w:tcMar>
+              <w:top w:type="dxa" w:w="60"/>
+              <w:left w:type="dxa" w:w="100"/>
+              <w:bottom w:type="dxa" w:w="60"/>
+              <w:right w:type="dxa" w:w="100"/>
+            </w:tcMar>
+          </w:tcPr>
+          <w:p>
+            <w:pPr>
+              <w:spacing w:after="40" w:line="252"/>
+              <w:jc w:val="left"/>
+            </w:pPr>
+            <w:r>
+              <w:rPr>
+                <w:rFonts w:ascii="Times New Roman" w:cs="Times New Roman" w:eastAsia="Times New Roman" w:hAnsi="Times New Roman"/>
+                <w:b w:val="false"/>
+                <w:bCs w:val="false"/>
+                <w:sz w:val="22"/>
+                <w:szCs w:val="22"/>
+              </w:rPr>
+              <w:t xml:space="preserve">Không cần làm</w:t>
+            </w:r>
+          </w:p>
+        </w:tc>
+        <w:tc>
+          <w:tcPr>
+            <w:tcW w:type="dxa" w:w="4938"/>
+            <w:tcBorders>
+              <w:top w:val="single" w:color="BFBFBF" w:sz="4"/>
+              <w:left w:val="single" w:color="BFBFBF" w:sz="4"/>
+              <w:bottom w:val="single" w:color="BFBFBF" w:sz="4"/>
+              <w:right w:val="single" w:color="BFBFBF" w:sz="4"/>
+            </w:tcBorders>
+            <w:tcMar>
+              <w:top w:type="dxa" w:w="60"/>
+              <w:left w:type="dxa" w:w="100"/>
+              <w:bottom w:type="dxa" w:w="60"/>
+              <w:right w:type="dxa" w:w="100"/>
+            </w:tcMar>
+          </w:tcPr>
+          <w:p>
+            <w:pPr>
+              <w:spacing w:after="40" w:line="252"/>
+              <w:jc w:val="left"/>
+            </w:pPr>
+            <w:r>
+              <w:rPr>
+                <w:rFonts w:ascii="Times New Roman" w:cs="Times New Roman" w:eastAsia="Times New Roman" w:hAnsi="Times New Roman"/>
+                <w:b w:val="false"/>
+                <w:bCs w:val="false"/>
+                <w:sz w:val="22"/>
+                <w:szCs w:val="22"/>
+              </w:rPr>
+              <w:t xml:space="preserve">PR #6 đã viết lại câu này; sửa riêng sẽ xung đột. Việc tiếp: chuẩn bị phần slide (</w:t>
+            </w:r>
+            <w:r>
+              <w:rPr>
+                <w:rFonts w:ascii="Consolas" w:cs="Consolas" w:eastAsia="Consolas" w:hAnsi="Consolas"/>
+                <w:sz w:val="19"/>
+                <w:szCs w:val="19"/>
+              </w:rPr>
+              <w:t xml:space="preserve">PHAN_CONG_SUA.md</w:t>
+            </w:r>
+            <w:r>
+              <w:rPr>
+                <w:rFonts w:ascii="Times New Roman" w:cs="Times New Roman" w:eastAsia="Times New Roman" w:hAnsi="Times New Roman"/>
+                <w:b w:val="false"/>
+                <w:bCs w:val="false"/>
+                <w:sz w:val="22"/>
+                <w:szCs w:val="22"/>
+              </w:rPr>
+              <w:t xml:space="preserve"> mục 7)</w:t>
             </w:r>
           </w:p>
         </w:tc>
@@ -6342,7 +6370,7 @@
                 <w:sz w:val="22"/>
                 <w:szCs w:val="22"/>
               </w:rPr>
-              <w:t xml:space="preserve">Luận</w:t>
+              <w:t xml:space="preserve">PR #6 đã sửa</w:t>
             </w:r>
           </w:p>
         </w:tc>
@@ -7473,25 +7501,7 @@
                 <w:sz w:val="22"/>
                 <w:szCs w:val="22"/>
               </w:rPr>
-              <w:t xml:space="preserve">; sửa câu "38 ca" ở </w:t>
-            </w:r>
-            <w:r>
-              <w:rPr>
-                <w:rFonts w:ascii="Consolas" w:cs="Consolas" w:eastAsia="Consolas" w:hAnsi="Consolas"/>
-                <w:sz w:val="19"/>
-                <w:szCs w:val="19"/>
-              </w:rPr>
-              <w:t xml:space="preserve">05_cai_dat.md</w:t>
-            </w:r>
-            <w:r>
-              <w:rPr>
-                <w:rFonts w:ascii="Times New Roman" w:cs="Times New Roman" w:eastAsia="Times New Roman" w:hAnsi="Times New Roman"/>
-                <w:b w:val="false"/>
-                <w:bCs w:val="false"/>
-                <w:sz w:val="22"/>
-                <w:szCs w:val="22"/>
-              </w:rPr>
-              <w:t xml:space="preserve">; chạy TC37, TC38 trên SQL Server, sửa 1.873, gộp PR #6</w:t>
+              <w:t xml:space="preserve">; H3 sửa 2 chỗ trong PR #6 (1.873, thứ tự TC37, TC38); chạy TC37, TC38 trên SQL Server, gộp PR #6</w:t>
             </w:r>
           </w:p>
         </w:tc>
@@ -7524,7 +7534,7 @@
                 <w:sz w:val="22"/>
                 <w:szCs w:val="22"/>
               </w:rPr>
-              <w:t xml:space="preserve">Quân, Luận, Hùng, Huynh</w:t>
+              <w:t xml:space="preserve">Quân, Hùng, Huynh</w:t>
             </w:r>
           </w:p>
         </w:tc>
@@ -7874,7 +7884,7 @@
                 <w:sz w:val="22"/>
                 <w:szCs w:val="22"/>
               </w:rPr>
-              <w:t xml:space="preserve">Từ T2 26/10</w:t>
+              <w:t xml:space="preserve">T4 28/10</w:t>
             </w:r>
           </w:p>
         </w:tc>
@@ -7907,7 +7917,25 @@
                 <w:sz w:val="22"/>
                 <w:szCs w:val="22"/>
               </w:rPr>
-              <w:t xml:space="preserve">Làm slide theo dàn ý KE_HOACH, chia phần trình bày, tập thuyết trình</w:t>
+              <w:t xml:space="preserve">Gửi nội dung slide và ghi chú người trình bày phần của mình (chia phần ở </w:t>
+            </w:r>
+            <w:r>
+              <w:rPr>
+                <w:rFonts w:ascii="Consolas" w:cs="Consolas" w:eastAsia="Consolas" w:hAnsi="Consolas"/>
+                <w:sz w:val="19"/>
+                <w:szCs w:val="19"/>
+              </w:rPr>
+              <w:t xml:space="preserve">PHAN_CONG_SUA.md</w:t>
+            </w:r>
+            <w:r>
+              <w:rPr>
+                <w:rFonts w:ascii="Times New Roman" w:cs="Times New Roman" w:eastAsia="Times New Roman" w:hAnsi="Times New Roman"/>
+                <w:b w:val="false"/>
+                <w:bCs w:val="false"/>
+                <w:sz w:val="22"/>
+                <w:szCs w:val="22"/>
+              </w:rPr>
+              <w:t xml:space="preserve"> mục 7); sau đó ghép slide, tập thuyết trình</w:t>
             </w:r>
           </w:p>
         </w:tc>

</xml_diff>